<commit_message>
[139] Correct morhology drills for Attic Greek and Latin
</commit_message>
<xml_diff>
--- a/site/drills/attic-greek/answers.docx
+++ b/site/drills/attic-greek/answers.docx
@@ -40722,24 +40722,6 @@
           <w:sz w:val="22"/>
           <w:szCs w:val="22"/>
         </w:rPr>
-      </w:r>
-    </w:p>
-    <w:p>
-      <w:pPr>
-        <w:pStyle w:val="Normal"/>
-        <w:bidi w:val="0"/>
-        <w:jc w:val="left"/>
-        <w:rPr>
-          <w:rFonts w:ascii="Liberation Serif" w:hAnsi="Liberation Serif"/>
-          <w:sz w:val="22"/>
-          <w:szCs w:val="22"/>
-        </w:rPr>
-      </w:pPr>
-      <w:r>
-        <w:rPr>
-          <w:sz w:val="22"/>
-          <w:szCs w:val="22"/>
-        </w:rPr>
         <w:t>--- Perfect ---</w:t>
       </w:r>
     </w:p>
@@ -41072,6 +41054,24 @@
           <w:szCs w:val="22"/>
         </w:rPr>
         <w:t>Show: δεδειχώς ἐσοίμην δεδειχώς ἔσοιο δεδειχώς ἔσοιτο δεδειχότες ἐσοίμεθα δεδειχότες ἔσοισθε δεδειχότες ἔσοιντο</w:t>
+      </w:r>
+    </w:p>
+    <w:p>
+      <w:pPr>
+        <w:pStyle w:val="Normal"/>
+        <w:bidi w:val="0"/>
+        <w:jc w:val="left"/>
+        <w:rPr>
+          <w:rFonts w:ascii="Liberation Serif" w:hAnsi="Liberation Serif"/>
+          <w:sz w:val="22"/>
+          <w:szCs w:val="22"/>
+        </w:rPr>
+      </w:pPr>
+      <w:r>
+        <w:rPr>
+          <w:sz w:val="22"/>
+          <w:szCs w:val="22"/>
+        </w:rPr>
       </w:r>
     </w:p>
     <w:p>

</xml_diff>

<commit_message>
[272]Correct Attic Greek drills
</commit_message>
<xml_diff>
--- a/site/drills/attic-greek/answers.docx
+++ b/site/drills/attic-greek/answers.docx
@@ -130,138 +130,132 @@
           <w:sz w:val="22"/>
           <w:szCs w:val="22"/>
         </w:rPr>
-        <w:t>Masc. sg.: ὁ τοῦ τῷ τόν</w:t>
-      </w:r>
-    </w:p>
-    <w:p>
-      <w:pPr>
-        <w:pStyle w:val="Normal"/>
-        <w:bidi w:val="0"/>
-        <w:jc w:val="left"/>
-        <w:rPr>
-          <w:rFonts w:ascii="Liberation Serif" w:hAnsi="Liberation Serif"/>
-          <w:sz w:val="22"/>
-          <w:szCs w:val="22"/>
-        </w:rPr>
-      </w:pPr>
-      <w:r>
-        <w:rPr>
-          <w:sz w:val="22"/>
-          <w:szCs w:val="22"/>
-        </w:rPr>
-        <w:t>Masc. pl.: οἱ τῶν τοῖς τούς</w:t>
-      </w:r>
-    </w:p>
-    <w:p>
-      <w:pPr>
-        <w:pStyle w:val="Normal"/>
-        <w:bidi w:val="0"/>
-        <w:jc w:val="left"/>
-        <w:rPr>
-          <w:rFonts w:ascii="Liberation Serif" w:hAnsi="Liberation Serif"/>
-          <w:sz w:val="22"/>
-          <w:szCs w:val="22"/>
-        </w:rPr>
-      </w:pPr>
-      <w:r>
-        <w:rPr>
-          <w:sz w:val="22"/>
-          <w:szCs w:val="22"/>
-        </w:rPr>
-      </w:r>
-    </w:p>
-    <w:p>
-      <w:pPr>
-        <w:pStyle w:val="Normal"/>
-        <w:bidi w:val="0"/>
-        <w:jc w:val="left"/>
-        <w:rPr>
-          <w:rFonts w:ascii="Liberation Serif" w:hAnsi="Liberation Serif"/>
-          <w:sz w:val="22"/>
-          <w:szCs w:val="22"/>
-        </w:rPr>
-      </w:pPr>
-      <w:r>
-        <w:rPr>
-          <w:sz w:val="22"/>
-          <w:szCs w:val="22"/>
-        </w:rPr>
-        <w:t>Fem. sg.: ἡ τῆς τῇ τήν</w:t>
-      </w:r>
-    </w:p>
-    <w:p>
-      <w:pPr>
-        <w:pStyle w:val="Normal"/>
-        <w:bidi w:val="0"/>
-        <w:jc w:val="left"/>
-        <w:rPr>
-          <w:rFonts w:ascii="Liberation Serif" w:hAnsi="Liberation Serif"/>
-          <w:sz w:val="22"/>
-          <w:szCs w:val="22"/>
-        </w:rPr>
-      </w:pPr>
-      <w:r>
-        <w:rPr>
-          <w:sz w:val="22"/>
-          <w:szCs w:val="22"/>
-        </w:rPr>
-        <w:t>Fem. pl.: αἱ τῶν ταῖς τάς</w:t>
-      </w:r>
-    </w:p>
-    <w:p>
-      <w:pPr>
-        <w:pStyle w:val="Normal"/>
-        <w:bidi w:val="0"/>
-        <w:jc w:val="left"/>
-        <w:rPr>
-          <w:rFonts w:ascii="Liberation Serif" w:hAnsi="Liberation Serif"/>
-          <w:sz w:val="22"/>
-          <w:szCs w:val="22"/>
-        </w:rPr>
-      </w:pPr>
-      <w:r>
-        <w:rPr>
-          <w:sz w:val="22"/>
-          <w:szCs w:val="22"/>
-        </w:rPr>
-      </w:r>
-    </w:p>
-    <w:p>
-      <w:pPr>
-        <w:pStyle w:val="Normal"/>
-        <w:bidi w:val="0"/>
-        <w:jc w:val="left"/>
-        <w:rPr>
-          <w:rFonts w:ascii="Liberation Serif" w:hAnsi="Liberation Serif"/>
-          <w:sz w:val="22"/>
-          <w:szCs w:val="22"/>
-        </w:rPr>
-      </w:pPr>
-      <w:r>
-        <w:rPr>
-          <w:sz w:val="22"/>
-          <w:szCs w:val="22"/>
-        </w:rPr>
-        <w:t>Neut. sg.: τό τοῦ τῷ τό</w:t>
-      </w:r>
-    </w:p>
-    <w:p>
-      <w:pPr>
-        <w:pStyle w:val="Normal"/>
-        <w:bidi w:val="0"/>
-        <w:jc w:val="left"/>
-        <w:rPr>
-          <w:rFonts w:ascii="Liberation Serif" w:hAnsi="Liberation Serif"/>
-          <w:sz w:val="22"/>
-          <w:szCs w:val="22"/>
-        </w:rPr>
-      </w:pPr>
-      <w:r>
-        <w:rPr>
-          <w:sz w:val="22"/>
-          <w:szCs w:val="22"/>
-        </w:rPr>
-        <w:t>Neut. pl.: τά τῶν τοῖς τά</w:t>
+        <w:t>M. sg.: ὁ τοῦ τῷ τόν</w:t>
+      </w:r>
+    </w:p>
+    <w:p>
+      <w:pPr>
+        <w:pStyle w:val="Normal"/>
+        <w:bidi w:val="0"/>
+        <w:jc w:val="left"/>
+        <w:rPr>
+          <w:rFonts w:ascii="Liberation Serif" w:hAnsi="Liberation Serif"/>
+          <w:sz w:val="22"/>
+          <w:szCs w:val="22"/>
+        </w:rPr>
+      </w:pPr>
+      <w:r>
+        <w:rPr>
+          <w:sz w:val="22"/>
+          <w:szCs w:val="22"/>
+        </w:rPr>
+        <w:t>M. pl.: οἱ τῶν τοῖς τούς</w:t>
+      </w:r>
+    </w:p>
+    <w:p>
+      <w:pPr>
+        <w:pStyle w:val="Normal"/>
+        <w:bidi w:val="0"/>
+        <w:jc w:val="left"/>
+        <w:rPr>
+          <w:rFonts w:ascii="Liberation Serif" w:hAnsi="Liberation Serif"/>
+          <w:sz w:val="22"/>
+          <w:szCs w:val="22"/>
+        </w:rPr>
+      </w:pPr>
+      <w:r>
+        <w:rPr/>
+      </w:r>
+    </w:p>
+    <w:p>
+      <w:pPr>
+        <w:pStyle w:val="Normal"/>
+        <w:bidi w:val="0"/>
+        <w:jc w:val="left"/>
+        <w:rPr>
+          <w:rFonts w:ascii="Liberation Serif" w:hAnsi="Liberation Serif"/>
+          <w:sz w:val="22"/>
+          <w:szCs w:val="22"/>
+        </w:rPr>
+      </w:pPr>
+      <w:r>
+        <w:rPr>
+          <w:sz w:val="22"/>
+          <w:szCs w:val="22"/>
+        </w:rPr>
+        <w:t>F. sg.: ἡ τῆς τῇ τήν</w:t>
+      </w:r>
+    </w:p>
+    <w:p>
+      <w:pPr>
+        <w:pStyle w:val="Normal"/>
+        <w:bidi w:val="0"/>
+        <w:jc w:val="left"/>
+        <w:rPr>
+          <w:rFonts w:ascii="Liberation Serif" w:hAnsi="Liberation Serif"/>
+          <w:sz w:val="22"/>
+          <w:szCs w:val="22"/>
+        </w:rPr>
+      </w:pPr>
+      <w:r>
+        <w:rPr>
+          <w:sz w:val="22"/>
+          <w:szCs w:val="22"/>
+        </w:rPr>
+        <w:t>F. pl.: αἱ τῶν ταῖς τάς</w:t>
+      </w:r>
+    </w:p>
+    <w:p>
+      <w:pPr>
+        <w:pStyle w:val="Normal"/>
+        <w:bidi w:val="0"/>
+        <w:jc w:val="left"/>
+        <w:rPr>
+          <w:rFonts w:ascii="Liberation Serif" w:hAnsi="Liberation Serif"/>
+          <w:sz w:val="22"/>
+          <w:szCs w:val="22"/>
+        </w:rPr>
+      </w:pPr>
+      <w:r>
+        <w:rPr/>
+      </w:r>
+    </w:p>
+    <w:p>
+      <w:pPr>
+        <w:pStyle w:val="Normal"/>
+        <w:bidi w:val="0"/>
+        <w:jc w:val="left"/>
+        <w:rPr>
+          <w:rFonts w:ascii="Liberation Serif" w:hAnsi="Liberation Serif"/>
+          <w:sz w:val="22"/>
+          <w:szCs w:val="22"/>
+        </w:rPr>
+      </w:pPr>
+      <w:r>
+        <w:rPr>
+          <w:sz w:val="22"/>
+          <w:szCs w:val="22"/>
+        </w:rPr>
+        <w:t>N. sg.: τό τοῦ τῷ τό</w:t>
+      </w:r>
+    </w:p>
+    <w:p>
+      <w:pPr>
+        <w:pStyle w:val="Normal"/>
+        <w:bidi w:val="0"/>
+        <w:jc w:val="left"/>
+        <w:rPr>
+          <w:rFonts w:ascii="Liberation Serif" w:hAnsi="Liberation Serif"/>
+          <w:sz w:val="22"/>
+          <w:szCs w:val="22"/>
+        </w:rPr>
+      </w:pPr>
+      <w:r>
+        <w:rPr>
+          <w:sz w:val="22"/>
+          <w:szCs w:val="22"/>
+        </w:rPr>
+        <w:t>N. pl.: τά τῶν τοῖς τά</w:t>
       </w:r>
     </w:p>
     <w:p>
@@ -4139,21 +4133,7 @@
           <w:sz w:val="22"/>
           <w:szCs w:val="22"/>
         </w:rPr>
-        <w:t>They (f.</w:t>
-      </w:r>
-      <w:r>
-        <w:rPr>
-          <w:sz w:val="22"/>
-          <w:szCs w:val="22"/>
-        </w:rPr>
-        <w:t>)</w:t>
-      </w:r>
-      <w:r>
-        <w:rPr>
-          <w:sz w:val="22"/>
-          <w:szCs w:val="22"/>
-        </w:rPr>
-        <w:t>: αὐταί αὐτῶν αὐταῖς αὐτάς</w:t>
+        <w:t>They (f.): αὐταί αὐτῶν αὐταῖς αὐτάς</w:t>
       </w:r>
     </w:p>
     <w:p>
@@ -4774,67 +4754,83 @@
         </w:rPr>
       </w:pPr>
       <w:r>
-        <w:rPr>
-          <w:sz w:val="22"/>
-          <w:szCs w:val="22"/>
-        </w:rPr>
-      </w:r>
-    </w:p>
-    <w:p>
-      <w:pPr>
-        <w:pStyle w:val="Normal"/>
-        <w:bidi w:val="0"/>
-        <w:jc w:val="left"/>
-        <w:rPr>
-          <w:rFonts w:ascii="Liberation Serif" w:hAnsi="Liberation Serif"/>
-          <w:sz w:val="22"/>
-          <w:szCs w:val="22"/>
-        </w:rPr>
-      </w:pPr>
-      <w:r>
-        <w:rPr>
-          <w:sz w:val="22"/>
-          <w:szCs w:val="22"/>
-        </w:rPr>
-        <w:t>--- 1-st person reflexive ἐμαυτοῦ ---</w:t>
-      </w:r>
-    </w:p>
-    <w:p>
-      <w:pPr>
-        <w:pStyle w:val="Normal"/>
-        <w:bidi w:val="0"/>
-        <w:jc w:val="left"/>
-        <w:rPr>
-          <w:rFonts w:ascii="Liberation Serif" w:hAnsi="Liberation Serif"/>
-          <w:sz w:val="22"/>
-          <w:szCs w:val="22"/>
-        </w:rPr>
-      </w:pPr>
-      <w:r>
-        <w:rPr>
-          <w:sz w:val="22"/>
-          <w:szCs w:val="22"/>
-        </w:rPr>
-        <w:t>--- 2-nd person reflexive σεαυτοῦ ---</w:t>
-      </w:r>
-    </w:p>
-    <w:p>
-      <w:pPr>
-        <w:pStyle w:val="Normal"/>
-        <w:bidi w:val="0"/>
-        <w:jc w:val="left"/>
-        <w:rPr>
-          <w:rFonts w:ascii="Liberation Serif" w:hAnsi="Liberation Serif"/>
-          <w:sz w:val="22"/>
-          <w:szCs w:val="22"/>
-        </w:rPr>
-      </w:pPr>
-      <w:r>
-        <w:rPr>
-          <w:sz w:val="22"/>
-          <w:szCs w:val="22"/>
-        </w:rPr>
-        <w:t>--- 3-rd person reflexive ἑαυτοῦ ---</w:t>
+        <w:rPr/>
+      </w:r>
+    </w:p>
+    <w:p>
+      <w:pPr>
+        <w:pStyle w:val="Normal"/>
+        <w:bidi w:val="0"/>
+        <w:jc w:val="left"/>
+        <w:rPr>
+          <w:rFonts w:ascii="Liberation Serif" w:hAnsi="Liberation Serif"/>
+          <w:sz w:val="22"/>
+          <w:szCs w:val="22"/>
+        </w:rPr>
+      </w:pPr>
+      <w:r>
+        <w:rPr>
+          <w:sz w:val="22"/>
+          <w:szCs w:val="22"/>
+        </w:rPr>
+        <w:t>--- 1-st person reflexive ἐμαυτοῦ ἐμαυτῆς ---</w:t>
+      </w:r>
+    </w:p>
+    <w:p>
+      <w:pPr>
+        <w:pStyle w:val="Normal"/>
+        <w:bidi w:val="0"/>
+        <w:jc w:val="left"/>
+        <w:rPr>
+          <w:rFonts w:ascii="Liberation Serif" w:hAnsi="Liberation Serif"/>
+          <w:sz w:val="22"/>
+          <w:szCs w:val="22"/>
+        </w:rPr>
+      </w:pPr>
+      <w:r>
+        <w:rPr>
+          <w:sz w:val="22"/>
+          <w:szCs w:val="22"/>
+        </w:rPr>
+        <w:t>--- 2-nd person reflexive σεαυτοῦ σεαυτῆς ---</w:t>
+      </w:r>
+    </w:p>
+    <w:p>
+      <w:pPr>
+        <w:pStyle w:val="Normal"/>
+        <w:bidi w:val="0"/>
+        <w:jc w:val="left"/>
+        <w:rPr>
+          <w:rFonts w:ascii="Liberation Serif" w:hAnsi="Liberation Serif"/>
+          <w:sz w:val="22"/>
+          <w:szCs w:val="22"/>
+        </w:rPr>
+      </w:pPr>
+      <w:r>
+        <w:rPr>
+          <w:sz w:val="22"/>
+          <w:szCs w:val="22"/>
+        </w:rPr>
+        <w:t>--- 3-rd person reflexive ἑαυτοῦ ἑαυτῆς ἑαυτοῦ ---</w:t>
+      </w:r>
+    </w:p>
+    <w:p>
+      <w:pPr>
+        <w:pStyle w:val="Normal"/>
+        <w:bidi w:val="0"/>
+        <w:jc w:val="left"/>
+        <w:rPr>
+          <w:rFonts w:ascii="Liberation Serif" w:hAnsi="Liberation Serif"/>
+          <w:sz w:val="22"/>
+          <w:szCs w:val="22"/>
+        </w:rPr>
+      </w:pPr>
+      <w:r>
+        <w:rPr>
+          <w:sz w:val="22"/>
+          <w:szCs w:val="22"/>
+        </w:rPr>
+        <w:t>--- 3-rd person reflexive αὑτοῦ αὑτῆς αὑτοῦ ---</w:t>
       </w:r>
     </w:p>
     <w:p>
@@ -4868,10 +4864,7 @@
         </w:rPr>
       </w:pPr>
       <w:r>
-        <w:rPr>
-          <w:sz w:val="22"/>
-          <w:szCs w:val="22"/>
-        </w:rPr>
+        <w:rPr/>
       </w:r>
     </w:p>
     <w:p>
@@ -4962,10 +4955,7 @@
         </w:rPr>
       </w:pPr>
       <w:r>
-        <w:rPr>
-          <w:sz w:val="22"/>
-          <w:szCs w:val="22"/>
-        </w:rPr>
+        <w:rPr/>
       </w:r>
     </w:p>
     <w:p>
@@ -5056,10 +5046,7 @@
         </w:rPr>
       </w:pPr>
       <w:r>
-        <w:rPr>
-          <w:sz w:val="22"/>
-          <w:szCs w:val="22"/>
-        </w:rPr>
+        <w:rPr/>
       </w:r>
     </w:p>
     <w:p>
@@ -5188,10 +5175,136 @@
         </w:rPr>
       </w:pPr>
       <w:r>
-        <w:rPr>
-          <w:sz w:val="22"/>
-          <w:szCs w:val="22"/>
-        </w:rPr>
+        <w:rPr/>
+      </w:r>
+    </w:p>
+    <w:p>
+      <w:pPr>
+        <w:pStyle w:val="Normal"/>
+        <w:bidi w:val="0"/>
+        <w:jc w:val="left"/>
+        <w:rPr>
+          <w:rFonts w:ascii="Liberation Serif" w:hAnsi="Liberation Serif"/>
+          <w:sz w:val="22"/>
+          <w:szCs w:val="22"/>
+        </w:rPr>
+      </w:pPr>
+      <w:r>
+        <w:rPr>
+          <w:sz w:val="22"/>
+          <w:szCs w:val="22"/>
+        </w:rPr>
+        <w:t>Himself (m. sg.): αὑτοῦ αὑτῷ αὑτόν</w:t>
+      </w:r>
+    </w:p>
+    <w:p>
+      <w:pPr>
+        <w:pStyle w:val="Normal"/>
+        <w:bidi w:val="0"/>
+        <w:jc w:val="left"/>
+        <w:rPr>
+          <w:rFonts w:ascii="Liberation Serif" w:hAnsi="Liberation Serif"/>
+          <w:sz w:val="22"/>
+          <w:szCs w:val="22"/>
+        </w:rPr>
+      </w:pPr>
+      <w:r>
+        <w:rPr>
+          <w:sz w:val="22"/>
+          <w:szCs w:val="22"/>
+        </w:rPr>
+        <w:t>Himself (m. pl.): αὑτῶν αὑτοῖς αὑτούς</w:t>
+      </w:r>
+    </w:p>
+    <w:p>
+      <w:pPr>
+        <w:pStyle w:val="Normal"/>
+        <w:bidi w:val="0"/>
+        <w:jc w:val="left"/>
+        <w:rPr>
+          <w:rFonts w:ascii="Liberation Serif" w:hAnsi="Liberation Serif"/>
+          <w:sz w:val="22"/>
+          <w:szCs w:val="22"/>
+        </w:rPr>
+      </w:pPr>
+      <w:r>
+        <w:rPr>
+          <w:sz w:val="22"/>
+          <w:szCs w:val="22"/>
+        </w:rPr>
+        <w:t>Himself (f. sg.): αὑτῆς αὑτῇ αὑτήν</w:t>
+      </w:r>
+    </w:p>
+    <w:p>
+      <w:pPr>
+        <w:pStyle w:val="Normal"/>
+        <w:bidi w:val="0"/>
+        <w:jc w:val="left"/>
+        <w:rPr>
+          <w:rFonts w:ascii="Liberation Serif" w:hAnsi="Liberation Serif"/>
+          <w:sz w:val="22"/>
+          <w:szCs w:val="22"/>
+        </w:rPr>
+      </w:pPr>
+      <w:r>
+        <w:rPr>
+          <w:sz w:val="22"/>
+          <w:szCs w:val="22"/>
+        </w:rPr>
+        <w:t>Himself (f. pl.): αὑτῶν αὑταῖς αὑτάς</w:t>
+      </w:r>
+    </w:p>
+    <w:p>
+      <w:pPr>
+        <w:pStyle w:val="Normal"/>
+        <w:bidi w:val="0"/>
+        <w:jc w:val="left"/>
+        <w:rPr>
+          <w:rFonts w:ascii="Liberation Serif" w:hAnsi="Liberation Serif"/>
+          <w:sz w:val="22"/>
+          <w:szCs w:val="22"/>
+        </w:rPr>
+      </w:pPr>
+      <w:r>
+        <w:rPr>
+          <w:sz w:val="22"/>
+          <w:szCs w:val="22"/>
+        </w:rPr>
+        <w:t>Himself (n. pl.): αὑτοῦ αὑτῷ αὑτό</w:t>
+      </w:r>
+    </w:p>
+    <w:p>
+      <w:pPr>
+        <w:pStyle w:val="Normal"/>
+        <w:bidi w:val="0"/>
+        <w:jc w:val="left"/>
+        <w:rPr>
+          <w:rFonts w:ascii="Liberation Serif" w:hAnsi="Liberation Serif"/>
+          <w:sz w:val="22"/>
+          <w:szCs w:val="22"/>
+        </w:rPr>
+      </w:pPr>
+      <w:r>
+        <w:rPr>
+          <w:sz w:val="22"/>
+          <w:szCs w:val="22"/>
+        </w:rPr>
+        <w:t>Himself (n. sg.): αὑτῶν αὑτοῖς αὑτά</w:t>
+      </w:r>
+    </w:p>
+    <w:p>
+      <w:pPr>
+        <w:pStyle w:val="Normal"/>
+        <w:bidi w:val="0"/>
+        <w:jc w:val="left"/>
+        <w:rPr>
+          <w:rFonts w:ascii="Liberation Serif" w:hAnsi="Liberation Serif"/>
+          <w:sz w:val="22"/>
+          <w:szCs w:val="22"/>
+        </w:rPr>
+      </w:pPr>
+      <w:r>
+        <w:rPr/>
       </w:r>
     </w:p>
     <w:p>
@@ -5306,25 +5419,22 @@
           <w:sz w:val="22"/>
           <w:szCs w:val="22"/>
         </w:rPr>
-        <w:t>=== Pronouns, Relative, Interrogative and Indefinite ===</w:t>
-      </w:r>
-    </w:p>
-    <w:p>
-      <w:pPr>
-        <w:pStyle w:val="Normal"/>
-        <w:bidi w:val="0"/>
-        <w:jc w:val="left"/>
-        <w:rPr>
-          <w:rFonts w:ascii="Liberation Serif" w:hAnsi="Liberation Serif"/>
-          <w:sz w:val="22"/>
-          <w:szCs w:val="22"/>
-        </w:rPr>
-      </w:pPr>
-      <w:r>
-        <w:rPr>
-          <w:sz w:val="22"/>
-          <w:szCs w:val="22"/>
-        </w:rPr>
+        <w:t>=== Pronouns, Relative ===</w:t>
+      </w:r>
+    </w:p>
+    <w:p>
+      <w:pPr>
+        <w:pStyle w:val="Normal"/>
+        <w:bidi w:val="0"/>
+        <w:jc w:val="left"/>
+        <w:rPr>
+          <w:rFonts w:ascii="Liberation Serif" w:hAnsi="Liberation Serif"/>
+          <w:sz w:val="22"/>
+          <w:szCs w:val="22"/>
+        </w:rPr>
+      </w:pPr>
+      <w:r>
+        <w:rPr/>
       </w:r>
     </w:p>
     <w:p>
@@ -5377,10 +5487,317 @@
         </w:rPr>
       </w:pPr>
       <w:r>
-        <w:rPr>
-          <w:sz w:val="22"/>
-          <w:szCs w:val="22"/>
-        </w:rPr>
+        <w:rPr/>
+      </w:r>
+    </w:p>
+    <w:p>
+      <w:pPr>
+        <w:pStyle w:val="Normal"/>
+        <w:bidi w:val="0"/>
+        <w:jc w:val="left"/>
+        <w:rPr>
+          <w:rFonts w:ascii="Liberation Serif" w:hAnsi="Liberation Serif"/>
+          <w:sz w:val="22"/>
+          <w:szCs w:val="22"/>
+        </w:rPr>
+      </w:pPr>
+      <w:r>
+        <w:rPr>
+          <w:sz w:val="22"/>
+          <w:szCs w:val="22"/>
+        </w:rPr>
+        <w:t>Who (m. sg.): ὅς οὗ ᾧ ὅν</w:t>
+      </w:r>
+    </w:p>
+    <w:p>
+      <w:pPr>
+        <w:pStyle w:val="Normal"/>
+        <w:bidi w:val="0"/>
+        <w:jc w:val="left"/>
+        <w:rPr>
+          <w:rFonts w:ascii="Liberation Serif" w:hAnsi="Liberation Serif"/>
+          <w:sz w:val="22"/>
+          <w:szCs w:val="22"/>
+        </w:rPr>
+      </w:pPr>
+      <w:r>
+        <w:rPr>
+          <w:sz w:val="22"/>
+          <w:szCs w:val="22"/>
+        </w:rPr>
+        <w:t>Who (m. pl.): οἵ ὧν οἷς οὕς</w:t>
+      </w:r>
+    </w:p>
+    <w:p>
+      <w:pPr>
+        <w:pStyle w:val="Normal"/>
+        <w:bidi w:val="0"/>
+        <w:jc w:val="left"/>
+        <w:rPr>
+          <w:rFonts w:ascii="Liberation Serif" w:hAnsi="Liberation Serif"/>
+          <w:sz w:val="22"/>
+          <w:szCs w:val="22"/>
+        </w:rPr>
+      </w:pPr>
+      <w:r>
+        <w:rPr>
+          <w:sz w:val="22"/>
+          <w:szCs w:val="22"/>
+        </w:rPr>
+        <w:t>Who (f. sg.): ἥ ἧς ᾗ ἥν</w:t>
+      </w:r>
+    </w:p>
+    <w:p>
+      <w:pPr>
+        <w:pStyle w:val="Normal"/>
+        <w:bidi w:val="0"/>
+        <w:jc w:val="left"/>
+        <w:rPr>
+          <w:rFonts w:ascii="Liberation Serif" w:hAnsi="Liberation Serif"/>
+          <w:sz w:val="22"/>
+          <w:szCs w:val="22"/>
+        </w:rPr>
+      </w:pPr>
+      <w:r>
+        <w:rPr>
+          <w:sz w:val="22"/>
+          <w:szCs w:val="22"/>
+        </w:rPr>
+        <w:t>Who (f. pl.): αἵ ὧν αἷς ἅς</w:t>
+      </w:r>
+    </w:p>
+    <w:p>
+      <w:pPr>
+        <w:pStyle w:val="Normal"/>
+        <w:bidi w:val="0"/>
+        <w:jc w:val="left"/>
+        <w:rPr>
+          <w:rFonts w:ascii="Liberation Serif" w:hAnsi="Liberation Serif"/>
+          <w:sz w:val="22"/>
+          <w:szCs w:val="22"/>
+        </w:rPr>
+      </w:pPr>
+      <w:r>
+        <w:rPr>
+          <w:sz w:val="22"/>
+          <w:szCs w:val="22"/>
+        </w:rPr>
+        <w:t>Who (n. pl.): ὅ οὗ ᾧ ὅ</w:t>
+      </w:r>
+    </w:p>
+    <w:p>
+      <w:pPr>
+        <w:pStyle w:val="Normal"/>
+        <w:bidi w:val="0"/>
+        <w:jc w:val="left"/>
+        <w:rPr>
+          <w:rFonts w:ascii="Liberation Serif" w:hAnsi="Liberation Serif"/>
+          <w:sz w:val="22"/>
+          <w:szCs w:val="22"/>
+        </w:rPr>
+      </w:pPr>
+      <w:r>
+        <w:rPr>
+          <w:sz w:val="22"/>
+          <w:szCs w:val="22"/>
+        </w:rPr>
+        <w:t>Who (n. sg.): ἅ ὧν οἷς ἅ</w:t>
+      </w:r>
+    </w:p>
+    <w:p>
+      <w:pPr>
+        <w:pStyle w:val="Normal"/>
+        <w:bidi w:val="0"/>
+        <w:jc w:val="left"/>
+        <w:rPr>
+          <w:rFonts w:ascii="Liberation Serif" w:hAnsi="Liberation Serif"/>
+          <w:sz w:val="22"/>
+          <w:szCs w:val="22"/>
+        </w:rPr>
+      </w:pPr>
+      <w:r>
+        <w:rPr/>
+      </w:r>
+    </w:p>
+    <w:p>
+      <w:pPr>
+        <w:pStyle w:val="Normal"/>
+        <w:bidi w:val="0"/>
+        <w:jc w:val="left"/>
+        <w:rPr>
+          <w:rFonts w:ascii="Liberation Serif" w:hAnsi="Liberation Serif"/>
+          <w:sz w:val="22"/>
+          <w:szCs w:val="22"/>
+        </w:rPr>
+      </w:pPr>
+      <w:r>
+        <w:rPr>
+          <w:sz w:val="22"/>
+          <w:szCs w:val="22"/>
+        </w:rPr>
+        <w:t>Whosoever (m. sg.): ὅστις οὗτινος ᾧτινι ὅντινα</w:t>
+      </w:r>
+    </w:p>
+    <w:p>
+      <w:pPr>
+        <w:pStyle w:val="Normal"/>
+        <w:bidi w:val="0"/>
+        <w:jc w:val="left"/>
+        <w:rPr>
+          <w:rFonts w:ascii="Liberation Serif" w:hAnsi="Liberation Serif"/>
+          <w:sz w:val="22"/>
+          <w:szCs w:val="22"/>
+        </w:rPr>
+      </w:pPr>
+      <w:r>
+        <w:rPr>
+          <w:sz w:val="22"/>
+          <w:szCs w:val="22"/>
+        </w:rPr>
+        <w:t>Whosoever (m. pl.): οἵτινες ὧντινων οἷστισι οὕστινας</w:t>
+      </w:r>
+    </w:p>
+    <w:p>
+      <w:pPr>
+        <w:pStyle w:val="Normal"/>
+        <w:bidi w:val="0"/>
+        <w:jc w:val="left"/>
+        <w:rPr>
+          <w:rFonts w:ascii="Liberation Serif" w:hAnsi="Liberation Serif"/>
+          <w:sz w:val="22"/>
+          <w:szCs w:val="22"/>
+        </w:rPr>
+      </w:pPr>
+      <w:r>
+        <w:rPr>
+          <w:sz w:val="22"/>
+          <w:szCs w:val="22"/>
+        </w:rPr>
+        <w:t>Whosoever (f. sg.): ἥτις ἧστινος ᾗτινι ἥντινα</w:t>
+      </w:r>
+    </w:p>
+    <w:p>
+      <w:pPr>
+        <w:pStyle w:val="Normal"/>
+        <w:bidi w:val="0"/>
+        <w:jc w:val="left"/>
+        <w:rPr>
+          <w:rFonts w:ascii="Liberation Serif" w:hAnsi="Liberation Serif"/>
+          <w:sz w:val="22"/>
+          <w:szCs w:val="22"/>
+        </w:rPr>
+      </w:pPr>
+      <w:r>
+        <w:rPr>
+          <w:sz w:val="22"/>
+          <w:szCs w:val="22"/>
+        </w:rPr>
+        <w:t>Whosoever (f. pl.): αἵτινες ὧντινων αἷστισι ἅστινας</w:t>
+      </w:r>
+    </w:p>
+    <w:p>
+      <w:pPr>
+        <w:pStyle w:val="Normal"/>
+        <w:bidi w:val="0"/>
+        <w:jc w:val="left"/>
+        <w:rPr>
+          <w:rFonts w:ascii="Liberation Serif" w:hAnsi="Liberation Serif"/>
+          <w:sz w:val="22"/>
+          <w:szCs w:val="22"/>
+        </w:rPr>
+      </w:pPr>
+      <w:r>
+        <w:rPr>
+          <w:sz w:val="22"/>
+          <w:szCs w:val="22"/>
+        </w:rPr>
+        <w:t>Whosoever (n. pl.): ὅ τι οὗτινος ᾧτινι ὅ τι</w:t>
+      </w:r>
+    </w:p>
+    <w:p>
+      <w:pPr>
+        <w:pStyle w:val="Normal"/>
+        <w:bidi w:val="0"/>
+        <w:jc w:val="left"/>
+        <w:rPr>
+          <w:rFonts w:ascii="Liberation Serif" w:hAnsi="Liberation Serif"/>
+          <w:sz w:val="22"/>
+          <w:szCs w:val="22"/>
+        </w:rPr>
+      </w:pPr>
+      <w:r>
+        <w:rPr>
+          <w:sz w:val="22"/>
+          <w:szCs w:val="22"/>
+        </w:rPr>
+        <w:t>Whosoever (n. sg.): ἅτινα ὧντινων οἷστισι ἅτινα</w:t>
+      </w:r>
+    </w:p>
+    <w:p>
+      <w:pPr>
+        <w:pStyle w:val="Normal"/>
+        <w:bidi w:val="0"/>
+        <w:jc w:val="left"/>
+        <w:rPr>
+          <w:rFonts w:ascii="Liberation Serif" w:hAnsi="Liberation Serif"/>
+          <w:sz w:val="22"/>
+          <w:szCs w:val="22"/>
+        </w:rPr>
+      </w:pPr>
+      <w:r>
+        <w:rPr/>
+      </w:r>
+    </w:p>
+    <w:p>
+      <w:pPr>
+        <w:pStyle w:val="Normal"/>
+        <w:bidi w:val="0"/>
+        <w:jc w:val="left"/>
+        <w:rPr>
+          <w:rFonts w:ascii="Liberation Serif" w:hAnsi="Liberation Serif"/>
+          <w:sz w:val="22"/>
+          <w:szCs w:val="22"/>
+        </w:rPr>
+      </w:pPr>
+      <w:r>
+        <w:rPr/>
+      </w:r>
+      <w:r>
+        <w:br w:type="page"/>
+      </w:r>
+    </w:p>
+    <w:p>
+      <w:pPr>
+        <w:pStyle w:val="Normal"/>
+        <w:bidi w:val="0"/>
+        <w:jc w:val="left"/>
+        <w:rPr/>
+      </w:pPr>
+      <w:r>
+        <w:rPr/>
+        <w:t>=== Pronouns, Interrogative, Indefinite and Negative ===</w:t>
+      </w:r>
+    </w:p>
+    <w:p>
+      <w:pPr>
+        <w:pStyle w:val="Normal"/>
+        <w:bidi w:val="0"/>
+        <w:jc w:val="left"/>
+        <w:rPr/>
+      </w:pPr>
+      <w:r>
+        <w:rPr/>
+      </w:r>
+    </w:p>
+    <w:p>
+      <w:pPr>
+        <w:pStyle w:val="Normal"/>
+        <w:bidi w:val="0"/>
+        <w:jc w:val="left"/>
+        <w:rPr/>
+      </w:pPr>
+      <w:r>
+        <w:rPr/>
         <w:t>--- interrogative τίς τί ---</w:t>
       </w:r>
     </w:p>
@@ -5389,17 +5806,10 @@
         <w:pStyle w:val="Normal"/>
         <w:bidi w:val="0"/>
         <w:jc w:val="left"/>
-        <w:rPr>
-          <w:rFonts w:ascii="Liberation Serif" w:hAnsi="Liberation Serif"/>
-          <w:sz w:val="22"/>
-          <w:szCs w:val="22"/>
-        </w:rPr>
-      </w:pPr>
-      <w:r>
-        <w:rPr>
-          <w:sz w:val="22"/>
-          <w:szCs w:val="22"/>
-        </w:rPr>
+        <w:rPr/>
+      </w:pPr>
+      <w:r>
+        <w:rPr/>
         <w:t>--- indefinite τις τι ---</w:t>
       </w:r>
     </w:p>
@@ -5408,299 +5818,45 @@
         <w:pStyle w:val="Normal"/>
         <w:bidi w:val="0"/>
         <w:jc w:val="left"/>
-        <w:rPr>
-          <w:rFonts w:ascii="Liberation Serif" w:hAnsi="Liberation Serif"/>
-          <w:sz w:val="22"/>
-          <w:szCs w:val="22"/>
-        </w:rPr>
-      </w:pPr>
-      <w:r>
-        <w:rPr>
-          <w:sz w:val="22"/>
-          <w:szCs w:val="22"/>
-        </w:rPr>
-      </w:r>
-    </w:p>
-    <w:p>
-      <w:pPr>
-        <w:pStyle w:val="Normal"/>
-        <w:bidi w:val="0"/>
-        <w:jc w:val="left"/>
-        <w:rPr>
-          <w:rFonts w:ascii="Liberation Serif" w:hAnsi="Liberation Serif"/>
-          <w:sz w:val="22"/>
-          <w:szCs w:val="22"/>
-        </w:rPr>
-      </w:pPr>
-      <w:r>
-        <w:rPr>
-          <w:sz w:val="22"/>
-          <w:szCs w:val="22"/>
-        </w:rPr>
-        <w:t>Who (m. sg.): ὅς οὗ ᾧ ὅν</w:t>
-      </w:r>
-    </w:p>
-    <w:p>
-      <w:pPr>
-        <w:pStyle w:val="Normal"/>
-        <w:bidi w:val="0"/>
-        <w:jc w:val="left"/>
-        <w:rPr>
-          <w:rFonts w:ascii="Liberation Serif" w:hAnsi="Liberation Serif"/>
-          <w:sz w:val="22"/>
-          <w:szCs w:val="22"/>
-        </w:rPr>
-      </w:pPr>
-      <w:r>
-        <w:rPr>
-          <w:sz w:val="22"/>
-          <w:szCs w:val="22"/>
-        </w:rPr>
-        <w:t>Who (m. pl.): οἵ ὧν οἷς οὕς</w:t>
-      </w:r>
-    </w:p>
-    <w:p>
-      <w:pPr>
-        <w:pStyle w:val="Normal"/>
-        <w:bidi w:val="0"/>
-        <w:jc w:val="left"/>
-        <w:rPr>
-          <w:rFonts w:ascii="Liberation Serif" w:hAnsi="Liberation Serif"/>
-          <w:sz w:val="22"/>
-          <w:szCs w:val="22"/>
-        </w:rPr>
-      </w:pPr>
-      <w:r>
-        <w:rPr>
-          <w:sz w:val="22"/>
-          <w:szCs w:val="22"/>
-        </w:rPr>
-        <w:t>Who (f. sg.): ἥ ἧς ᾗ ἥν</w:t>
-      </w:r>
-    </w:p>
-    <w:p>
-      <w:pPr>
-        <w:pStyle w:val="Normal"/>
-        <w:bidi w:val="0"/>
-        <w:jc w:val="left"/>
-        <w:rPr>
-          <w:rFonts w:ascii="Liberation Serif" w:hAnsi="Liberation Serif"/>
-          <w:sz w:val="22"/>
-          <w:szCs w:val="22"/>
-        </w:rPr>
-      </w:pPr>
-      <w:r>
-        <w:rPr>
-          <w:sz w:val="22"/>
-          <w:szCs w:val="22"/>
-        </w:rPr>
-        <w:t>Who (f. pl.): αἵ ὧν αἷς ἅς</w:t>
-      </w:r>
-    </w:p>
-    <w:p>
-      <w:pPr>
-        <w:pStyle w:val="Normal"/>
-        <w:bidi w:val="0"/>
-        <w:jc w:val="left"/>
-        <w:rPr>
-          <w:rFonts w:ascii="Liberation Serif" w:hAnsi="Liberation Serif"/>
-          <w:sz w:val="22"/>
-          <w:szCs w:val="22"/>
-        </w:rPr>
-      </w:pPr>
-      <w:r>
-        <w:rPr>
-          <w:sz w:val="22"/>
-          <w:szCs w:val="22"/>
-        </w:rPr>
-        <w:t>Who (n. pl.): ὅ οὗ ᾧ ὅ</w:t>
-      </w:r>
-    </w:p>
-    <w:p>
-      <w:pPr>
-        <w:pStyle w:val="Normal"/>
-        <w:bidi w:val="0"/>
-        <w:jc w:val="left"/>
-        <w:rPr>
-          <w:rFonts w:ascii="Liberation Serif" w:hAnsi="Liberation Serif"/>
-          <w:sz w:val="22"/>
-          <w:szCs w:val="22"/>
-        </w:rPr>
-      </w:pPr>
-      <w:r>
-        <w:rPr>
-          <w:sz w:val="22"/>
-          <w:szCs w:val="22"/>
-        </w:rPr>
-        <w:t>Who (n. sg.): ἅ ὧν οἷς ἅ</w:t>
-      </w:r>
-    </w:p>
-    <w:p>
-      <w:pPr>
-        <w:pStyle w:val="Normal"/>
-        <w:bidi w:val="0"/>
-        <w:jc w:val="left"/>
-        <w:rPr>
-          <w:rFonts w:ascii="Liberation Serif" w:hAnsi="Liberation Serif"/>
-          <w:sz w:val="22"/>
-          <w:szCs w:val="22"/>
-        </w:rPr>
-      </w:pPr>
-      <w:r>
-        <w:rPr>
-          <w:sz w:val="22"/>
-          <w:szCs w:val="22"/>
-        </w:rPr>
-      </w:r>
-    </w:p>
-    <w:p>
-      <w:pPr>
-        <w:pStyle w:val="Normal"/>
-        <w:bidi w:val="0"/>
-        <w:jc w:val="left"/>
-        <w:rPr>
-          <w:rFonts w:ascii="Liberation Serif" w:hAnsi="Liberation Serif"/>
-          <w:sz w:val="22"/>
-          <w:szCs w:val="22"/>
-        </w:rPr>
-      </w:pPr>
-      <w:r>
-        <w:rPr>
-          <w:sz w:val="22"/>
-          <w:szCs w:val="22"/>
-        </w:rPr>
-        <w:t>Whosoever (m. sg.): ὅστις οὗτινος ᾧτινι ὅντινα</w:t>
-      </w:r>
-    </w:p>
-    <w:p>
-      <w:pPr>
-        <w:pStyle w:val="Normal"/>
-        <w:bidi w:val="0"/>
-        <w:jc w:val="left"/>
-        <w:rPr>
-          <w:rFonts w:ascii="Liberation Serif" w:hAnsi="Liberation Serif"/>
-          <w:sz w:val="22"/>
-          <w:szCs w:val="22"/>
-        </w:rPr>
-      </w:pPr>
-      <w:r>
-        <w:rPr>
-          <w:sz w:val="22"/>
-          <w:szCs w:val="22"/>
-        </w:rPr>
-        <w:t>Whosoever (m. pl.): οἵτινες ὧντινων οἷστισι οὕστινας</w:t>
-      </w:r>
-    </w:p>
-    <w:p>
-      <w:pPr>
-        <w:pStyle w:val="Normal"/>
-        <w:bidi w:val="0"/>
-        <w:jc w:val="left"/>
-        <w:rPr>
-          <w:rFonts w:ascii="Liberation Serif" w:hAnsi="Liberation Serif"/>
-          <w:sz w:val="22"/>
-          <w:szCs w:val="22"/>
-        </w:rPr>
-      </w:pPr>
-      <w:r>
-        <w:rPr>
-          <w:sz w:val="22"/>
-          <w:szCs w:val="22"/>
-        </w:rPr>
-        <w:t>Whosoever (f. sg.): ἥτις ἧστινος ᾗτινι ἥντινα</w:t>
-      </w:r>
-    </w:p>
-    <w:p>
-      <w:pPr>
-        <w:pStyle w:val="Normal"/>
-        <w:bidi w:val="0"/>
-        <w:jc w:val="left"/>
-        <w:rPr>
-          <w:rFonts w:ascii="Liberation Serif" w:hAnsi="Liberation Serif"/>
-          <w:sz w:val="22"/>
-          <w:szCs w:val="22"/>
-        </w:rPr>
-      </w:pPr>
-      <w:r>
-        <w:rPr>
-          <w:sz w:val="22"/>
-          <w:szCs w:val="22"/>
-        </w:rPr>
-        <w:t>Whosoever (f. pl.): αἵτινες ὧντινων αἷστισι ἅστινας</w:t>
-      </w:r>
-    </w:p>
-    <w:p>
-      <w:pPr>
-        <w:pStyle w:val="Normal"/>
-        <w:bidi w:val="0"/>
-        <w:jc w:val="left"/>
-        <w:rPr>
-          <w:rFonts w:ascii="Liberation Serif" w:hAnsi="Liberation Serif"/>
-          <w:sz w:val="22"/>
-          <w:szCs w:val="22"/>
-        </w:rPr>
-      </w:pPr>
-      <w:r>
-        <w:rPr>
-          <w:sz w:val="22"/>
-          <w:szCs w:val="22"/>
-        </w:rPr>
-        <w:t>Whosoever (n. pl.): ὅ τι οὗτινος ᾧτινι ὅ τι</w:t>
-      </w:r>
-    </w:p>
-    <w:p>
-      <w:pPr>
-        <w:pStyle w:val="Normal"/>
-        <w:bidi w:val="0"/>
-        <w:jc w:val="left"/>
-        <w:rPr>
-          <w:rFonts w:ascii="Liberation Serif" w:hAnsi="Liberation Serif"/>
-          <w:sz w:val="22"/>
-          <w:szCs w:val="22"/>
-        </w:rPr>
-      </w:pPr>
-      <w:r>
-        <w:rPr>
-          <w:sz w:val="22"/>
-          <w:szCs w:val="22"/>
-        </w:rPr>
-        <w:t>Whosoever (n. sg.): ἅτινα ὧντινων οἷστισι ἅτινα</w:t>
-      </w:r>
-    </w:p>
-    <w:p>
-      <w:pPr>
-        <w:pStyle w:val="Normal"/>
-        <w:bidi w:val="0"/>
-        <w:jc w:val="left"/>
-        <w:rPr>
-          <w:rFonts w:ascii="Liberation Serif" w:hAnsi="Liberation Serif"/>
-          <w:sz w:val="22"/>
-          <w:szCs w:val="22"/>
-        </w:rPr>
-      </w:pPr>
-      <w:r>
-        <w:rPr>
-          <w:sz w:val="22"/>
-          <w:szCs w:val="22"/>
-        </w:rPr>
-      </w:r>
-    </w:p>
-    <w:p>
-      <w:pPr>
-        <w:pStyle w:val="Normal"/>
-        <w:bidi w:val="0"/>
-        <w:jc w:val="left"/>
-        <w:rPr>
-          <w:rFonts w:ascii="Liberation Serif" w:hAnsi="Liberation Serif"/>
-          <w:sz w:val="22"/>
-          <w:szCs w:val="22"/>
-        </w:rPr>
-      </w:pPr>
-      <w:r>
-        <w:rPr>
-          <w:sz w:val="22"/>
-          <w:szCs w:val="22"/>
-        </w:rPr>
+        <w:rPr/>
+      </w:pPr>
+      <w:r>
+        <w:rPr/>
+        <w:t>--- negative οὐδείς οὐδεμία οὐδέν ---</w:t>
+      </w:r>
+    </w:p>
+    <w:p>
+      <w:pPr>
+        <w:pStyle w:val="Normal"/>
+        <w:bidi w:val="0"/>
+        <w:jc w:val="left"/>
+        <w:rPr/>
+      </w:pPr>
+      <w:r>
+        <w:rPr/>
+        <w:t>--- negative μηδείς μηδεμία μηδέν ---</w:t>
+      </w:r>
+    </w:p>
+    <w:p>
+      <w:pPr>
+        <w:pStyle w:val="Normal"/>
+        <w:bidi w:val="0"/>
+        <w:jc w:val="left"/>
+        <w:rPr/>
+      </w:pPr>
+      <w:r>
+        <w:rPr/>
+      </w:r>
+    </w:p>
+    <w:p>
+      <w:pPr>
+        <w:pStyle w:val="Normal"/>
+        <w:bidi w:val="0"/>
+        <w:jc w:val="left"/>
+        <w:rPr/>
+      </w:pPr>
+      <w:r>
+        <w:rPr/>
         <w:t>Who? (m-f. sg.): τίς τίνος τίνι τίνα</w:t>
       </w:r>
     </w:p>
@@ -5709,17 +5865,10 @@
         <w:pStyle w:val="Normal"/>
         <w:bidi w:val="0"/>
         <w:jc w:val="left"/>
-        <w:rPr>
-          <w:rFonts w:ascii="Liberation Serif" w:hAnsi="Liberation Serif"/>
-          <w:sz w:val="22"/>
-          <w:szCs w:val="22"/>
-        </w:rPr>
-      </w:pPr>
-      <w:r>
-        <w:rPr>
-          <w:sz w:val="22"/>
-          <w:szCs w:val="22"/>
-        </w:rPr>
+        <w:rPr/>
+      </w:pPr>
+      <w:r>
+        <w:rPr/>
         <w:t>Who? (m-f. pl.): τίνες τίνων τίσι τίνας</w:t>
       </w:r>
     </w:p>
@@ -5728,17 +5877,10 @@
         <w:pStyle w:val="Normal"/>
         <w:bidi w:val="0"/>
         <w:jc w:val="left"/>
-        <w:rPr>
-          <w:rFonts w:ascii="Liberation Serif" w:hAnsi="Liberation Serif"/>
-          <w:sz w:val="22"/>
-          <w:szCs w:val="22"/>
-        </w:rPr>
-      </w:pPr>
-      <w:r>
-        <w:rPr>
-          <w:sz w:val="22"/>
-          <w:szCs w:val="22"/>
-        </w:rPr>
+        <w:rPr/>
+      </w:pPr>
+      <w:r>
+        <w:rPr/>
         <w:t>Who? (n. pl.): τί τίνος τίνι τί</w:t>
       </w:r>
     </w:p>
@@ -5747,17 +5889,10 @@
         <w:pStyle w:val="Normal"/>
         <w:bidi w:val="0"/>
         <w:jc w:val="left"/>
-        <w:rPr>
-          <w:rFonts w:ascii="Liberation Serif" w:hAnsi="Liberation Serif"/>
-          <w:sz w:val="22"/>
-          <w:szCs w:val="22"/>
-        </w:rPr>
-      </w:pPr>
-      <w:r>
-        <w:rPr>
-          <w:sz w:val="22"/>
-          <w:szCs w:val="22"/>
-        </w:rPr>
+        <w:rPr/>
+      </w:pPr>
+      <w:r>
+        <w:rPr/>
         <w:t>Who? (n. sg.): τίνα τίνων τίσι τίνα</w:t>
       </w:r>
     </w:p>
@@ -5766,35 +5901,21 @@
         <w:pStyle w:val="Normal"/>
         <w:bidi w:val="0"/>
         <w:jc w:val="left"/>
-        <w:rPr>
-          <w:rFonts w:ascii="Liberation Serif" w:hAnsi="Liberation Serif"/>
-          <w:sz w:val="22"/>
-          <w:szCs w:val="22"/>
-        </w:rPr>
-      </w:pPr>
-      <w:r>
-        <w:rPr>
-          <w:sz w:val="22"/>
-          <w:szCs w:val="22"/>
-        </w:rPr>
-      </w:r>
-    </w:p>
-    <w:p>
-      <w:pPr>
-        <w:pStyle w:val="Normal"/>
-        <w:bidi w:val="0"/>
-        <w:jc w:val="left"/>
-        <w:rPr>
-          <w:rFonts w:ascii="Liberation Serif" w:hAnsi="Liberation Serif"/>
-          <w:sz w:val="22"/>
-          <w:szCs w:val="22"/>
-        </w:rPr>
-      </w:pPr>
-      <w:r>
-        <w:rPr>
-          <w:sz w:val="22"/>
-          <w:szCs w:val="22"/>
-        </w:rPr>
+        <w:rPr/>
+      </w:pPr>
+      <w:r>
+        <w:rPr/>
+      </w:r>
+    </w:p>
+    <w:p>
+      <w:pPr>
+        <w:pStyle w:val="Normal"/>
+        <w:bidi w:val="0"/>
+        <w:jc w:val="left"/>
+        <w:rPr/>
+      </w:pPr>
+      <w:r>
+        <w:rPr/>
         <w:t>Who (m-f. sg.): τίς τινός τινί τινά</w:t>
       </w:r>
     </w:p>
@@ -5803,17 +5924,10 @@
         <w:pStyle w:val="Normal"/>
         <w:bidi w:val="0"/>
         <w:jc w:val="left"/>
-        <w:rPr>
-          <w:rFonts w:ascii="Liberation Serif" w:hAnsi="Liberation Serif"/>
-          <w:sz w:val="22"/>
-          <w:szCs w:val="22"/>
-        </w:rPr>
-      </w:pPr>
-      <w:r>
-        <w:rPr>
-          <w:sz w:val="22"/>
-          <w:szCs w:val="22"/>
-        </w:rPr>
+        <w:rPr/>
+      </w:pPr>
+      <w:r>
+        <w:rPr/>
         <w:t>Who (m-f. pl.): τινές τινῶν τισί τινάς</w:t>
       </w:r>
     </w:p>
@@ -5822,17 +5936,10 @@
         <w:pStyle w:val="Normal"/>
         <w:bidi w:val="0"/>
         <w:jc w:val="left"/>
-        <w:rPr>
-          <w:rFonts w:ascii="Liberation Serif" w:hAnsi="Liberation Serif"/>
-          <w:sz w:val="22"/>
-          <w:szCs w:val="22"/>
-        </w:rPr>
-      </w:pPr>
-      <w:r>
-        <w:rPr>
-          <w:sz w:val="22"/>
-          <w:szCs w:val="22"/>
-        </w:rPr>
+        <w:rPr/>
+      </w:pPr>
+      <w:r>
+        <w:rPr/>
         <w:t>Who (n. pl.): τί τινός τινί τί</w:t>
       </w:r>
     </w:p>
@@ -5841,17 +5948,10 @@
         <w:pStyle w:val="Normal"/>
         <w:bidi w:val="0"/>
         <w:jc w:val="left"/>
-        <w:rPr>
-          <w:rFonts w:ascii="Liberation Serif" w:hAnsi="Liberation Serif"/>
-          <w:sz w:val="22"/>
-          <w:szCs w:val="22"/>
-        </w:rPr>
-      </w:pPr>
-      <w:r>
-        <w:rPr>
-          <w:sz w:val="22"/>
-          <w:szCs w:val="22"/>
-        </w:rPr>
+        <w:rPr/>
+      </w:pPr>
+      <w:r>
+        <w:rPr/>
         <w:t>Who (n. sg.): τινά τινῶν τισί τινά</w:t>
       </w:r>
     </w:p>
@@ -5860,6 +5960,100 @@
         <w:pStyle w:val="Normal"/>
         <w:bidi w:val="0"/>
         <w:jc w:val="left"/>
+        <w:rPr/>
+      </w:pPr>
+      <w:r>
+        <w:rPr/>
+      </w:r>
+    </w:p>
+    <w:p>
+      <w:pPr>
+        <w:pStyle w:val="Normal"/>
+        <w:bidi w:val="0"/>
+        <w:jc w:val="left"/>
+        <w:rPr/>
+      </w:pPr>
+      <w:r>
+        <w:rPr/>
+        <w:t>None (m. sg.): οὐδείς οὐδενός οὐδενί οὐδένα</w:t>
+      </w:r>
+    </w:p>
+    <w:p>
+      <w:pPr>
+        <w:pStyle w:val="Normal"/>
+        <w:bidi w:val="0"/>
+        <w:jc w:val="left"/>
+        <w:rPr/>
+      </w:pPr>
+      <w:r>
+        <w:rPr/>
+        <w:t>None (f. sg.): οὐδεμία οὐδεμιᾶς οὐδεμιᾷ οὐδεμίαν</w:t>
+      </w:r>
+    </w:p>
+    <w:p>
+      <w:pPr>
+        <w:pStyle w:val="Normal"/>
+        <w:bidi w:val="0"/>
+        <w:jc w:val="left"/>
+        <w:rPr/>
+      </w:pPr>
+      <w:r>
+        <w:rPr/>
+        <w:t>None (n. sg.): οὐδέν οὐδενός οὐδενί οὐδέν</w:t>
+      </w:r>
+    </w:p>
+    <w:p>
+      <w:pPr>
+        <w:pStyle w:val="Normal"/>
+        <w:bidi w:val="0"/>
+        <w:jc w:val="left"/>
+        <w:rPr/>
+      </w:pPr>
+      <w:r>
+        <w:rPr/>
+      </w:r>
+    </w:p>
+    <w:p>
+      <w:pPr>
+        <w:pStyle w:val="Normal"/>
+        <w:bidi w:val="0"/>
+        <w:jc w:val="left"/>
+        <w:rPr/>
+      </w:pPr>
+      <w:r>
+        <w:rPr/>
+        <w:t>None (m. sg.): μηδείς μηδενός μηδενί μηδένα</w:t>
+      </w:r>
+    </w:p>
+    <w:p>
+      <w:pPr>
+        <w:pStyle w:val="Normal"/>
+        <w:bidi w:val="0"/>
+        <w:jc w:val="left"/>
+        <w:rPr/>
+      </w:pPr>
+      <w:r>
+        <w:rPr/>
+        <w:t>None (f. sg.): μηδεμία μηδεμιᾶς μηδεμιᾷ μηδεμίαν</w:t>
+      </w:r>
+    </w:p>
+    <w:p>
+      <w:pPr>
+        <w:pStyle w:val="Normal"/>
+        <w:bidi w:val="0"/>
+        <w:jc w:val="left"/>
+        <w:rPr/>
+      </w:pPr>
+      <w:r>
+        <w:rPr/>
+        <w:t>None (n. sg.): μηδέν μηδενός μηδενί μηδέν</w:t>
+      </w:r>
+    </w:p>
+    <w:p>
+      <w:pPr>
+        <w:pStyle w:val="Normal"/>
+        <w:bidi w:val="0"/>
+        <w:jc w:val="left"/>
         <w:rPr>
           <w:rFonts w:ascii="Liberation Serif" w:hAnsi="Liberation Serif"/>
           <w:sz w:val="22"/>
@@ -5910,100 +6104,94 @@
           <w:sz w:val="22"/>
           <w:szCs w:val="22"/>
         </w:rPr>
-        <w:t>=== Pronouns, Correlative ===</w:t>
-      </w:r>
-    </w:p>
-    <w:p>
-      <w:pPr>
-        <w:pStyle w:val="Normal"/>
-        <w:bidi w:val="0"/>
-        <w:jc w:val="left"/>
-        <w:rPr>
-          <w:rFonts w:ascii="Liberation Serif" w:hAnsi="Liberation Serif"/>
-          <w:sz w:val="22"/>
-          <w:szCs w:val="22"/>
-        </w:rPr>
-      </w:pPr>
-      <w:r>
-        <w:rPr>
-          <w:sz w:val="22"/>
-          <w:szCs w:val="22"/>
-        </w:rPr>
-      </w:r>
-    </w:p>
-    <w:p>
-      <w:pPr>
-        <w:pStyle w:val="Normal"/>
-        <w:bidi w:val="0"/>
-        <w:jc w:val="left"/>
-        <w:rPr>
-          <w:rFonts w:ascii="Liberation Serif" w:hAnsi="Liberation Serif"/>
-          <w:sz w:val="22"/>
-          <w:szCs w:val="22"/>
-        </w:rPr>
-      </w:pPr>
-      <w:r>
-        <w:rPr>
-          <w:sz w:val="22"/>
-          <w:szCs w:val="22"/>
-        </w:rPr>
-        <w:t>--- ποῖος ποία ποῖον ---</w:t>
-      </w:r>
-    </w:p>
-    <w:p>
-      <w:pPr>
-        <w:pStyle w:val="Normal"/>
-        <w:bidi w:val="0"/>
-        <w:jc w:val="left"/>
-        <w:rPr>
-          <w:rFonts w:ascii="Liberation Serif" w:hAnsi="Liberation Serif"/>
-          <w:sz w:val="22"/>
-          <w:szCs w:val="22"/>
-        </w:rPr>
-      </w:pPr>
-      <w:r>
-        <w:rPr>
-          <w:sz w:val="22"/>
-          <w:szCs w:val="22"/>
-        </w:rPr>
-        <w:t>--- πόσος πόση πόσον ---</w:t>
-      </w:r>
-    </w:p>
-    <w:p>
-      <w:pPr>
-        <w:pStyle w:val="Normal"/>
-        <w:bidi w:val="0"/>
-        <w:jc w:val="left"/>
-        <w:rPr>
-          <w:rFonts w:ascii="Liberation Serif" w:hAnsi="Liberation Serif"/>
-          <w:sz w:val="22"/>
-          <w:szCs w:val="22"/>
-        </w:rPr>
-      </w:pPr>
-      <w:r>
-        <w:rPr>
-          <w:sz w:val="22"/>
-          <w:szCs w:val="22"/>
-        </w:rPr>
-        <w:t>--- πότερος ποτέρα πότερον ---</w:t>
-      </w:r>
-    </w:p>
-    <w:p>
-      <w:pPr>
-        <w:pStyle w:val="Normal"/>
-        <w:bidi w:val="0"/>
-        <w:jc w:val="left"/>
-        <w:rPr>
-          <w:rFonts w:ascii="Liberation Serif" w:hAnsi="Liberation Serif"/>
-          <w:sz w:val="22"/>
-          <w:szCs w:val="22"/>
-        </w:rPr>
-      </w:pPr>
-      <w:r>
-        <w:rPr>
-          <w:sz w:val="22"/>
-          <w:szCs w:val="22"/>
-        </w:rPr>
+        <w:t>=== Pronouns, Other Interrogative ===</w:t>
+      </w:r>
+    </w:p>
+    <w:p>
+      <w:pPr>
+        <w:pStyle w:val="Normal"/>
+        <w:bidi w:val="0"/>
+        <w:jc w:val="left"/>
+        <w:rPr>
+          <w:rFonts w:ascii="Liberation Serif" w:hAnsi="Liberation Serif"/>
+          <w:sz w:val="22"/>
+          <w:szCs w:val="22"/>
+        </w:rPr>
+      </w:pPr>
+      <w:r>
+        <w:rPr/>
+      </w:r>
+    </w:p>
+    <w:p>
+      <w:pPr>
+        <w:pStyle w:val="Normal"/>
+        <w:bidi w:val="0"/>
+        <w:jc w:val="left"/>
+        <w:rPr>
+          <w:rFonts w:ascii="Liberation Serif" w:hAnsi="Liberation Serif"/>
+          <w:sz w:val="22"/>
+          <w:szCs w:val="22"/>
+        </w:rPr>
+      </w:pPr>
+      <w:r>
+        <w:rPr>
+          <w:sz w:val="22"/>
+          <w:szCs w:val="22"/>
+        </w:rPr>
+        <w:t>--- qualitative interrogative ποῖος ποία ποῖον ---</w:t>
+      </w:r>
+    </w:p>
+    <w:p>
+      <w:pPr>
+        <w:pStyle w:val="Normal"/>
+        <w:bidi w:val="0"/>
+        <w:jc w:val="left"/>
+        <w:rPr>
+          <w:rFonts w:ascii="Liberation Serif" w:hAnsi="Liberation Serif"/>
+          <w:sz w:val="22"/>
+          <w:szCs w:val="22"/>
+        </w:rPr>
+      </w:pPr>
+      <w:r>
+        <w:rPr>
+          <w:sz w:val="22"/>
+          <w:szCs w:val="22"/>
+        </w:rPr>
+        <w:t>--- quantitative interrogative πόσος πόση πόσον ---</w:t>
+      </w:r>
+    </w:p>
+    <w:p>
+      <w:pPr>
+        <w:pStyle w:val="Normal"/>
+        <w:bidi w:val="0"/>
+        <w:jc w:val="left"/>
+        <w:rPr>
+          <w:rFonts w:ascii="Liberation Serif" w:hAnsi="Liberation Serif"/>
+          <w:sz w:val="22"/>
+          <w:szCs w:val="22"/>
+        </w:rPr>
+      </w:pPr>
+      <w:r>
+        <w:rPr>
+          <w:sz w:val="22"/>
+          <w:szCs w:val="22"/>
+        </w:rPr>
+        <w:t>--- selective interrogative πότερος ποτέρα πότερον ---</w:t>
+      </w:r>
+    </w:p>
+    <w:p>
+      <w:pPr>
+        <w:pStyle w:val="Normal"/>
+        <w:bidi w:val="0"/>
+        <w:jc w:val="left"/>
+        <w:rPr>
+          <w:rFonts w:ascii="Liberation Serif" w:hAnsi="Liberation Serif"/>
+          <w:sz w:val="22"/>
+          <w:szCs w:val="22"/>
+        </w:rPr>
+      </w:pPr>
+      <w:r>
+        <w:rPr/>
       </w:r>
     </w:p>
     <w:p>
@@ -6132,10 +6320,7 @@
         </w:rPr>
       </w:pPr>
       <w:r>
-        <w:rPr>
-          <w:sz w:val="22"/>
-          <w:szCs w:val="22"/>
-        </w:rPr>
+        <w:rPr/>
       </w:r>
     </w:p>
     <w:p>
@@ -6264,10 +6449,7 @@
         </w:rPr>
       </w:pPr>
       <w:r>
-        <w:rPr>
-          <w:sz w:val="22"/>
-          <w:szCs w:val="22"/>
-        </w:rPr>
+        <w:rPr/>
       </w:r>
     </w:p>
     <w:p>
@@ -35267,7 +35449,7 @@
     </w:r>
     <w:r>
       <w:rPr/>
-      <w:t>47</w:t>
+      <w:t>48</w:t>
     </w:r>
     <w:r>
       <w:rPr/>

</xml_diff>